<commit_message>
Classes 5 and 6 materials.
</commit_message>
<xml_diff>
--- a/class05w.docx
+++ b/class05w.docx
@@ -144,28 +144,13 @@
               <w:rPr>
                 <w:rStyle w:val="VerbatimChar"/>
               </w:rPr>
-              <w:t xml:space="preserve">kable()</w:t>
+              <w:t xml:space="preserve">kable_styling()</w:t>
             </w:r>
             <w:r>
               <w:t xml:space="preserve"> </w:t>
             </w:r>
             <w:r>
-              <w:t xml:space="preserve">and</w:t>
-            </w:r>
-            <w:r>
-              <w:t xml:space="preserve"> </w:t>
-            </w:r>
-            <w:r>
-              <w:rPr>
-                <w:rStyle w:val="VerbatimChar"/>
-              </w:rPr>
-              <w:t xml:space="preserve">kable_styling()</w:t>
-            </w:r>
-            <w:r>
-              <w:t xml:space="preserve"> </w:t>
-            </w:r>
-            <w:r>
-              <w:t xml:space="preserve">stuff used in the HTML slides doesn’t work in Word. Hence, those bits of code are</w:t>
+              <w:t xml:space="preserve">stuff used to adjust font sizes in the HTML slides doesn’t work in Word. Hence, those bits of code are</w:t>
             </w:r>
             <w:r>
               <w:t xml:space="preserve"> </w:t>
@@ -6148,6 +6133,416 @@
           <w:rStyle w:val="NormalTok"/>
         </w:rPr>
         <w:t xml:space="preserve">)</w:t>
+      </w:r>
+    </w:p>
+    <w:tbl>
+      <w:tblPr>
+        <w:tblStyle w:val="Table"/>
+        <w:tblW w:type="auto" w:w="0"/>
+        <w:tblLook w:firstRow="1" w:lastRow="0" w:firstColumn="0" w:lastColumn="0" w:noHBand="0" w:noVBand="0" w:val="0020"/>
+      </w:tblPr>
+      <w:tblGrid>
+        <w:gridCol w:w="792"/>
+        <w:gridCol w:w="792"/>
+        <w:gridCol w:w="792"/>
+        <w:gridCol w:w="792"/>
+        <w:gridCol w:w="792"/>
+        <w:gridCol w:w="792"/>
+        <w:gridCol w:w="792"/>
+        <w:gridCol w:w="792"/>
+        <w:gridCol w:w="792"/>
+        <w:gridCol w:w="792"/>
+      </w:tblGrid>
+      <w:tr>
+        <w:trPr>
+          <w:tblHeader w:val="on"/>
+        </w:trPr>
+        <w:tc>
+          <w:tcPr/>
+          <w:p>
+            <w:pPr>
+              <w:pStyle w:val="Compact"/>
+              <w:jc w:val="right"/>
+            </w:pPr>
+            <w:r>
+              <w:t xml:space="preserve">n</w:t>
+            </w:r>
+          </w:p>
+        </w:tc>
+        <w:tc>
+          <w:tcPr/>
+          <w:p>
+            <w:pPr>
+              <w:pStyle w:val="Compact"/>
+              <w:jc w:val="right"/>
+            </w:pPr>
+            <w:r>
+              <w:t xml:space="preserve">miss</w:t>
+            </w:r>
+          </w:p>
+        </w:tc>
+        <w:tc>
+          <w:tcPr/>
+          <w:p>
+            <w:pPr>
+              <w:pStyle w:val="Compact"/>
+              <w:jc w:val="right"/>
+            </w:pPr>
+            <w:r>
+              <w:t xml:space="preserve">mean</w:t>
+            </w:r>
+          </w:p>
+        </w:tc>
+        <w:tc>
+          <w:tcPr/>
+          <w:p>
+            <w:pPr>
+              <w:pStyle w:val="Compact"/>
+              <w:jc w:val="right"/>
+            </w:pPr>
+            <w:r>
+              <w:t xml:space="preserve">sd</w:t>
+            </w:r>
+          </w:p>
+        </w:tc>
+        <w:tc>
+          <w:tcPr/>
+          <w:p>
+            <w:pPr>
+              <w:pStyle w:val="Compact"/>
+              <w:jc w:val="right"/>
+            </w:pPr>
+            <w:r>
+              <w:t xml:space="preserve">med</w:t>
+            </w:r>
+          </w:p>
+        </w:tc>
+        <w:tc>
+          <w:tcPr/>
+          <w:p>
+            <w:pPr>
+              <w:pStyle w:val="Compact"/>
+              <w:jc w:val="right"/>
+            </w:pPr>
+            <w:r>
+              <w:t xml:space="preserve">mad</w:t>
+            </w:r>
+          </w:p>
+        </w:tc>
+        <w:tc>
+          <w:tcPr/>
+          <w:p>
+            <w:pPr>
+              <w:pStyle w:val="Compact"/>
+              <w:jc w:val="right"/>
+            </w:pPr>
+            <w:r>
+              <w:t xml:space="preserve">min</w:t>
+            </w:r>
+          </w:p>
+        </w:tc>
+        <w:tc>
+          <w:tcPr/>
+          <w:p>
+            <w:pPr>
+              <w:pStyle w:val="Compact"/>
+              <w:jc w:val="right"/>
+            </w:pPr>
+            <w:r>
+              <w:t xml:space="preserve">q25</w:t>
+            </w:r>
+          </w:p>
+        </w:tc>
+        <w:tc>
+          <w:tcPr/>
+          <w:p>
+            <w:pPr>
+              <w:pStyle w:val="Compact"/>
+              <w:jc w:val="right"/>
+            </w:pPr>
+            <w:r>
+              <w:t xml:space="preserve">q75</w:t>
+            </w:r>
+          </w:p>
+        </w:tc>
+        <w:tc>
+          <w:tcPr/>
+          <w:p>
+            <w:pPr>
+              <w:pStyle w:val="Compact"/>
+              <w:jc w:val="right"/>
+            </w:pPr>
+            <w:r>
+              <w:t xml:space="preserve">max</w:t>
+            </w:r>
+          </w:p>
+        </w:tc>
+      </w:tr>
+      <w:tr>
+        <w:tc>
+          <w:tcPr/>
+          <w:p>
+            <w:pPr>
+              <w:pStyle w:val="Compact"/>
+              <w:jc w:val="right"/>
+            </w:pPr>
+            <w:r>
+              <w:t xml:space="preserve">464</w:t>
+            </w:r>
+          </w:p>
+        </w:tc>
+        <w:tc>
+          <w:tcPr/>
+          <w:p>
+            <w:pPr>
+              <w:pStyle w:val="Compact"/>
+              <w:jc w:val="right"/>
+            </w:pPr>
+            <w:r>
+              <w:t xml:space="preserve">0</w:t>
+            </w:r>
+          </w:p>
+        </w:tc>
+        <w:tc>
+          <w:tcPr/>
+          <w:p>
+            <w:pPr>
+              <w:pStyle w:val="Compact"/>
+              <w:jc w:val="right"/>
+            </w:pPr>
+            <w:r>
+              <w:t xml:space="preserve">0.33</w:t>
+            </w:r>
+          </w:p>
+        </w:tc>
+        <w:tc>
+          <w:tcPr/>
+          <w:p>
+            <w:pPr>
+              <w:pStyle w:val="Compact"/>
+              <w:jc w:val="right"/>
+            </w:pPr>
+            <w:r>
+              <w:t xml:space="preserve">1.79</w:t>
+            </w:r>
+          </w:p>
+        </w:tc>
+        <w:tc>
+          <w:tcPr/>
+          <w:p>
+            <w:pPr>
+              <w:pStyle w:val="Compact"/>
+              <w:jc w:val="right"/>
+            </w:pPr>
+            <w:r>
+              <w:t xml:space="preserve">0.2</w:t>
+            </w:r>
+          </w:p>
+        </w:tc>
+        <w:tc>
+          <w:tcPr/>
+          <w:p>
+            <w:pPr>
+              <w:pStyle w:val="Compact"/>
+              <w:jc w:val="right"/>
+            </w:pPr>
+            <w:r>
+              <w:t xml:space="preserve">1.19</w:t>
+            </w:r>
+          </w:p>
+        </w:tc>
+        <w:tc>
+          <w:tcPr/>
+          <w:p>
+            <w:pPr>
+              <w:pStyle w:val="Compact"/>
+              <w:jc w:val="right"/>
+            </w:pPr>
+            <w:r>
+              <w:t xml:space="preserve">-5.9</w:t>
+            </w:r>
+          </w:p>
+        </w:tc>
+        <w:tc>
+          <w:tcPr/>
+          <w:p>
+            <w:pPr>
+              <w:pStyle w:val="Compact"/>
+              <w:jc w:val="right"/>
+            </w:pPr>
+            <w:r>
+              <w:t xml:space="preserve">-0.5</w:t>
+            </w:r>
+          </w:p>
+        </w:tc>
+        <w:tc>
+          <w:tcPr/>
+          <w:p>
+            <w:pPr>
+              <w:pStyle w:val="Compact"/>
+              <w:jc w:val="right"/>
+            </w:pPr>
+            <w:r>
+              <w:t xml:space="preserve">1.1</w:t>
+            </w:r>
+          </w:p>
+        </w:tc>
+        <w:tc>
+          <w:tcPr/>
+          <w:p>
+            <w:pPr>
+              <w:pStyle w:val="Compact"/>
+              <w:jc w:val="right"/>
+            </w:pPr>
+            <w:r>
+              <w:t xml:space="preserve">8.9</w:t>
+            </w:r>
+          </w:p>
+        </w:tc>
+      </w:tr>
+    </w:tbl>
+    <w:p>
+      <w:pPr>
+        <w:pStyle w:val="BodyText"/>
+      </w:pPr>
+      <w:r>
+        <w:t xml:space="preserve">or, using the</w:t>
+      </w:r>
+      <w:r>
+        <w:t xml:space="preserve"> </w:t>
+      </w:r>
+      <w:r>
+        <w:rPr>
+          <w:b/>
+          <w:bCs/>
+        </w:rPr>
+        <w:t xml:space="preserve">knitr</w:t>
+      </w:r>
+      <w:r>
+        <w:t xml:space="preserve"> </w:t>
+      </w:r>
+      <w:r>
+        <w:t xml:space="preserve">and</w:t>
+      </w:r>
+      <w:r>
+        <w:t xml:space="preserve"> </w:t>
+      </w:r>
+      <w:r>
+        <w:rPr>
+          <w:b/>
+          <w:bCs/>
+        </w:rPr>
+        <w:t xml:space="preserve">kableExtra</w:t>
+      </w:r>
+      <w:r>
+        <w:t xml:space="preserve"> </w:t>
+      </w:r>
+      <w:r>
+        <w:t xml:space="preserve">packages…</w:t>
+      </w:r>
+    </w:p>
+    <w:p>
+      <w:pPr>
+        <w:pStyle w:val="SourceCode"/>
+      </w:pPr>
+      <w:r>
+        <w:rPr>
+          <w:rStyle w:val="NormalTok"/>
+        </w:rPr>
+        <w:t xml:space="preserve">class05 </w:t>
+      </w:r>
+      <w:r>
+        <w:rPr>
+          <w:rStyle w:val="SpecialCharTok"/>
+        </w:rPr>
+        <w:t xml:space="preserve">|&gt;</w:t>
+      </w:r>
+      <w:r>
+        <w:rPr>
+          <w:rStyle w:val="NormalTok"/>
+        </w:rPr>
+        <w:t xml:space="preserve"> </w:t>
+      </w:r>
+      <w:r>
+        <w:rPr>
+          <w:rStyle w:val="FunctionTok"/>
+        </w:rPr>
+        <w:t xml:space="preserve">reframe</w:t>
+      </w:r>
+      <w:r>
+        <w:rPr>
+          <w:rStyle w:val="NormalTok"/>
+        </w:rPr>
+        <w:t xml:space="preserve">(</w:t>
+      </w:r>
+      <w:r>
+        <w:rPr>
+          <w:rStyle w:val="FunctionTok"/>
+        </w:rPr>
+        <w:t xml:space="preserve">lovedist</w:t>
+      </w:r>
+      <w:r>
+        <w:rPr>
+          <w:rStyle w:val="NormalTok"/>
+        </w:rPr>
+        <w:t xml:space="preserve">(a1c_diff)) </w:t>
+      </w:r>
+      <w:r>
+        <w:rPr>
+          <w:rStyle w:val="SpecialCharTok"/>
+        </w:rPr>
+        <w:t xml:space="preserve">|&gt;</w:t>
+      </w:r>
+      <w:r>
+        <w:rPr>
+          <w:rStyle w:val="NormalTok"/>
+        </w:rPr>
+        <w:t xml:space="preserve"> </w:t>
+      </w:r>
+      <w:r>
+        <w:br/>
+      </w:r>
+      <w:r>
+        <w:rPr>
+          <w:rStyle w:val="NormalTok"/>
+        </w:rPr>
+        <w:t xml:space="preserve">  </w:t>
+      </w:r>
+      <w:r>
+        <w:rPr>
+          <w:rStyle w:val="FunctionTok"/>
+        </w:rPr>
+        <w:t xml:space="preserve">kable</w:t>
+      </w:r>
+      <w:r>
+        <w:rPr>
+          <w:rStyle w:val="NormalTok"/>
+        </w:rPr>
+        <w:t xml:space="preserve">(</w:t>
+      </w:r>
+      <w:r>
+        <w:rPr>
+          <w:rStyle w:val="AttributeTok"/>
+        </w:rPr>
+        <w:t xml:space="preserve">digits =</w:t>
+      </w:r>
+      <w:r>
+        <w:rPr>
+          <w:rStyle w:val="NormalTok"/>
+        </w:rPr>
+        <w:t xml:space="preserve"> </w:t>
+      </w:r>
+      <w:r>
+        <w:rPr>
+          <w:rStyle w:val="DecValTok"/>
+        </w:rPr>
+        <w:t xml:space="preserve">2</w:t>
+      </w:r>
+      <w:r>
+        <w:rPr>
+          <w:rStyle w:val="NormalTok"/>
+        </w:rPr>
+        <w:t xml:space="preserve">) </w:t>
       </w:r>
     </w:p>
     <w:tbl>
@@ -7302,7 +7697,7 @@
               <a:graphicData uri="http://schemas.openxmlformats.org/drawingml/2006/picture">
                 <pic:pic>
                   <pic:nvPicPr>
-                    <pic:cNvPr descr="class05w_files/figure-docx/unnamed-chunk-20-1.png" id="59" name="Picture"/>
+                    <pic:cNvPr descr="class05w_files/figure-docx/unnamed-chunk-21-1.png" id="59" name="Picture"/>
                     <pic:cNvPicPr>
                       <a:picLocks noChangeArrowheads="1" noChangeAspect="1"/>
                     </pic:cNvPicPr>
@@ -9037,7 +9432,7 @@
               <a:graphicData uri="http://schemas.openxmlformats.org/drawingml/2006/picture">
                 <pic:pic>
                   <pic:nvPicPr>
-                    <pic:cNvPr descr="class05w_files/figure-docx/unnamed-chunk-24-1.png" id="67" name="Picture"/>
+                    <pic:cNvPr descr="class05w_files/figure-docx/unnamed-chunk-25-1.png" id="67" name="Picture"/>
                     <pic:cNvPicPr>
                       <a:picLocks noChangeArrowheads="1" noChangeAspect="1"/>
                     </pic:cNvPicPr>
@@ -9146,45 +9541,330 @@
         </w:rPr>
         <w:t xml:space="preserve">(a1c_diff)) </w:t>
       </w:r>
-    </w:p>
-    <w:p>
-      <w:pPr>
-        <w:pStyle w:val="SourceCode"/>
-      </w:pPr>
-      <w:r>
-        <w:rPr>
-          <w:rStyle w:val="VerbatimChar"/>
-        </w:rPr>
-        <w:t xml:space="preserve"># A tibble: 1 × 10</w:t>
-      </w:r>
-      <w:r>
-        <w:br/>
-      </w:r>
-      <w:r>
-        <w:rPr>
-          <w:rStyle w:val="VerbatimChar"/>
-        </w:rPr>
-        <w:t xml:space="preserve">      n  miss  mean    sd   med   mad   min   q25   q75   max</w:t>
-      </w:r>
-      <w:r>
-        <w:br/>
-      </w:r>
-      <w:r>
-        <w:rPr>
-          <w:rStyle w:val="VerbatimChar"/>
-        </w:rPr>
-        <w:t xml:space="preserve">  &lt;int&gt; &lt;int&gt; &lt;dbl&gt; &lt;dbl&gt; &lt;dbl&gt; &lt;dbl&gt; &lt;dbl&gt; &lt;dbl&gt; &lt;dbl&gt; &lt;dbl&gt;</w:t>
-      </w:r>
-      <w:r>
-        <w:br/>
-      </w:r>
-      <w:r>
-        <w:rPr>
-          <w:rStyle w:val="VerbatimChar"/>
-        </w:rPr>
-        <w:t xml:space="preserve">1   464     0 0.332  1.79 0.200  1.19  -5.9  -0.5   1.1   8.9</w:t>
-      </w:r>
-    </w:p>
+      <w:r>
+        <w:rPr>
+          <w:rStyle w:val="SpecialCharTok"/>
+        </w:rPr>
+        <w:t xml:space="preserve">|&gt;</w:t>
+      </w:r>
+      <w:r>
+        <w:rPr>
+          <w:rStyle w:val="NormalTok"/>
+        </w:rPr>
+        <w:t xml:space="preserve"> </w:t>
+      </w:r>
+      <w:r>
+        <w:br/>
+      </w:r>
+      <w:r>
+        <w:rPr>
+          <w:rStyle w:val="NormalTok"/>
+        </w:rPr>
+        <w:t xml:space="preserve">  </w:t>
+      </w:r>
+      <w:r>
+        <w:rPr>
+          <w:rStyle w:val="FunctionTok"/>
+        </w:rPr>
+        <w:t xml:space="preserve">kable</w:t>
+      </w:r>
+      <w:r>
+        <w:rPr>
+          <w:rStyle w:val="NormalTok"/>
+        </w:rPr>
+        <w:t xml:space="preserve">(</w:t>
+      </w:r>
+      <w:r>
+        <w:rPr>
+          <w:rStyle w:val="AttributeTok"/>
+        </w:rPr>
+        <w:t xml:space="preserve">digits =</w:t>
+      </w:r>
+      <w:r>
+        <w:rPr>
+          <w:rStyle w:val="NormalTok"/>
+        </w:rPr>
+        <w:t xml:space="preserve"> </w:t>
+      </w:r>
+      <w:r>
+        <w:rPr>
+          <w:rStyle w:val="DecValTok"/>
+        </w:rPr>
+        <w:t xml:space="preserve">2</w:t>
+      </w:r>
+      <w:r>
+        <w:rPr>
+          <w:rStyle w:val="NormalTok"/>
+        </w:rPr>
+        <w:t xml:space="preserve">) </w:t>
+      </w:r>
+    </w:p>
+    <w:tbl>
+      <w:tblPr>
+        <w:tblStyle w:val="Table"/>
+        <w:tblW w:type="auto" w:w="0"/>
+        <w:tblLook w:firstRow="1" w:lastRow="0" w:firstColumn="0" w:lastColumn="0" w:noHBand="0" w:noVBand="0" w:val="0020"/>
+      </w:tblPr>
+      <w:tblGrid>
+        <w:gridCol w:w="792"/>
+        <w:gridCol w:w="792"/>
+        <w:gridCol w:w="792"/>
+        <w:gridCol w:w="792"/>
+        <w:gridCol w:w="792"/>
+        <w:gridCol w:w="792"/>
+        <w:gridCol w:w="792"/>
+        <w:gridCol w:w="792"/>
+        <w:gridCol w:w="792"/>
+        <w:gridCol w:w="792"/>
+      </w:tblGrid>
+      <w:tr>
+        <w:trPr>
+          <w:tblHeader w:val="on"/>
+        </w:trPr>
+        <w:tc>
+          <w:tcPr/>
+          <w:p>
+            <w:pPr>
+              <w:pStyle w:val="Compact"/>
+              <w:jc w:val="right"/>
+            </w:pPr>
+            <w:r>
+              <w:t xml:space="preserve">n</w:t>
+            </w:r>
+          </w:p>
+        </w:tc>
+        <w:tc>
+          <w:tcPr/>
+          <w:p>
+            <w:pPr>
+              <w:pStyle w:val="Compact"/>
+              <w:jc w:val="right"/>
+            </w:pPr>
+            <w:r>
+              <w:t xml:space="preserve">miss</w:t>
+            </w:r>
+          </w:p>
+        </w:tc>
+        <w:tc>
+          <w:tcPr/>
+          <w:p>
+            <w:pPr>
+              <w:pStyle w:val="Compact"/>
+              <w:jc w:val="right"/>
+            </w:pPr>
+            <w:r>
+              <w:t xml:space="preserve">mean</w:t>
+            </w:r>
+          </w:p>
+        </w:tc>
+        <w:tc>
+          <w:tcPr/>
+          <w:p>
+            <w:pPr>
+              <w:pStyle w:val="Compact"/>
+              <w:jc w:val="right"/>
+            </w:pPr>
+            <w:r>
+              <w:t xml:space="preserve">sd</w:t>
+            </w:r>
+          </w:p>
+        </w:tc>
+        <w:tc>
+          <w:tcPr/>
+          <w:p>
+            <w:pPr>
+              <w:pStyle w:val="Compact"/>
+              <w:jc w:val="right"/>
+            </w:pPr>
+            <w:r>
+              <w:t xml:space="preserve">med</w:t>
+            </w:r>
+          </w:p>
+        </w:tc>
+        <w:tc>
+          <w:tcPr/>
+          <w:p>
+            <w:pPr>
+              <w:pStyle w:val="Compact"/>
+              <w:jc w:val="right"/>
+            </w:pPr>
+            <w:r>
+              <w:t xml:space="preserve">mad</w:t>
+            </w:r>
+          </w:p>
+        </w:tc>
+        <w:tc>
+          <w:tcPr/>
+          <w:p>
+            <w:pPr>
+              <w:pStyle w:val="Compact"/>
+              <w:jc w:val="right"/>
+            </w:pPr>
+            <w:r>
+              <w:t xml:space="preserve">min</w:t>
+            </w:r>
+          </w:p>
+        </w:tc>
+        <w:tc>
+          <w:tcPr/>
+          <w:p>
+            <w:pPr>
+              <w:pStyle w:val="Compact"/>
+              <w:jc w:val="right"/>
+            </w:pPr>
+            <w:r>
+              <w:t xml:space="preserve">q25</w:t>
+            </w:r>
+          </w:p>
+        </w:tc>
+        <w:tc>
+          <w:tcPr/>
+          <w:p>
+            <w:pPr>
+              <w:pStyle w:val="Compact"/>
+              <w:jc w:val="right"/>
+            </w:pPr>
+            <w:r>
+              <w:t xml:space="preserve">q75</w:t>
+            </w:r>
+          </w:p>
+        </w:tc>
+        <w:tc>
+          <w:tcPr/>
+          <w:p>
+            <w:pPr>
+              <w:pStyle w:val="Compact"/>
+              <w:jc w:val="right"/>
+            </w:pPr>
+            <w:r>
+              <w:t xml:space="preserve">max</w:t>
+            </w:r>
+          </w:p>
+        </w:tc>
+      </w:tr>
+      <w:tr>
+        <w:tc>
+          <w:tcPr/>
+          <w:p>
+            <w:pPr>
+              <w:pStyle w:val="Compact"/>
+              <w:jc w:val="right"/>
+            </w:pPr>
+            <w:r>
+              <w:t xml:space="preserve">464</w:t>
+            </w:r>
+          </w:p>
+        </w:tc>
+        <w:tc>
+          <w:tcPr/>
+          <w:p>
+            <w:pPr>
+              <w:pStyle w:val="Compact"/>
+              <w:jc w:val="right"/>
+            </w:pPr>
+            <w:r>
+              <w:t xml:space="preserve">0</w:t>
+            </w:r>
+          </w:p>
+        </w:tc>
+        <w:tc>
+          <w:tcPr/>
+          <w:p>
+            <w:pPr>
+              <w:pStyle w:val="Compact"/>
+              <w:jc w:val="right"/>
+            </w:pPr>
+            <w:r>
+              <w:t xml:space="preserve">0.33</w:t>
+            </w:r>
+          </w:p>
+        </w:tc>
+        <w:tc>
+          <w:tcPr/>
+          <w:p>
+            <w:pPr>
+              <w:pStyle w:val="Compact"/>
+              <w:jc w:val="right"/>
+            </w:pPr>
+            <w:r>
+              <w:t xml:space="preserve">1.79</w:t>
+            </w:r>
+          </w:p>
+        </w:tc>
+        <w:tc>
+          <w:tcPr/>
+          <w:p>
+            <w:pPr>
+              <w:pStyle w:val="Compact"/>
+              <w:jc w:val="right"/>
+            </w:pPr>
+            <w:r>
+              <w:t xml:space="preserve">0.2</w:t>
+            </w:r>
+          </w:p>
+        </w:tc>
+        <w:tc>
+          <w:tcPr/>
+          <w:p>
+            <w:pPr>
+              <w:pStyle w:val="Compact"/>
+              <w:jc w:val="right"/>
+            </w:pPr>
+            <w:r>
+              <w:t xml:space="preserve">1.19</w:t>
+            </w:r>
+          </w:p>
+        </w:tc>
+        <w:tc>
+          <w:tcPr/>
+          <w:p>
+            <w:pPr>
+              <w:pStyle w:val="Compact"/>
+              <w:jc w:val="right"/>
+            </w:pPr>
+            <w:r>
+              <w:t xml:space="preserve">-5.9</w:t>
+            </w:r>
+          </w:p>
+        </w:tc>
+        <w:tc>
+          <w:tcPr/>
+          <w:p>
+            <w:pPr>
+              <w:pStyle w:val="Compact"/>
+              <w:jc w:val="right"/>
+            </w:pPr>
+            <w:r>
+              <w:t xml:space="preserve">-0.5</w:t>
+            </w:r>
+          </w:p>
+        </w:tc>
+        <w:tc>
+          <w:tcPr/>
+          <w:p>
+            <w:pPr>
+              <w:pStyle w:val="Compact"/>
+              <w:jc w:val="right"/>
+            </w:pPr>
+            <w:r>
+              <w:t xml:space="preserve">1.1</w:t>
+            </w:r>
+          </w:p>
+        </w:tc>
+        <w:tc>
+          <w:tcPr/>
+          <w:p>
+            <w:pPr>
+              <w:pStyle w:val="Compact"/>
+              <w:jc w:val="right"/>
+            </w:pPr>
+            <w:r>
+              <w:t xml:space="preserve">8.9</w:t>
+            </w:r>
+          </w:p>
+        </w:tc>
+      </w:tr>
+    </w:tbl>
     <w:p>
       <w:pPr>
         <w:pStyle w:val="Compact"/>
@@ -11324,7 +12004,7 @@
               <a:graphicData uri="http://schemas.openxmlformats.org/drawingml/2006/picture">
                 <pic:pic>
                   <pic:nvPicPr>
-                    <pic:cNvPr descr="class05w_files/figure-docx/unnamed-chunk-31-1.png" id="83" name="Picture"/>
+                    <pic:cNvPr descr="class05w_files/figure-docx/unnamed-chunk-32-1.png" id="83" name="Picture"/>
                     <pic:cNvPicPr>
                       <a:picLocks noChangeArrowheads="1" noChangeAspect="1"/>
                     </pic:cNvPicPr>
@@ -11950,7 +12630,7 @@
               <a:graphicData uri="http://schemas.openxmlformats.org/drawingml/2006/picture">
                 <pic:pic>
                   <pic:nvPicPr>
-                    <pic:cNvPr descr="class05w_files/figure-docx/unnamed-chunk-32-1.png" id="87" name="Picture"/>
+                    <pic:cNvPr descr="class05w_files/figure-docx/unnamed-chunk-33-1.png" id="87" name="Picture"/>
                     <pic:cNvPicPr>
                       <a:picLocks noChangeArrowheads="1" noChangeAspect="1"/>
                     </pic:cNvPicPr>
@@ -12321,7 +13001,7 @@
               <a:graphicData uri="http://schemas.openxmlformats.org/drawingml/2006/picture">
                 <pic:pic>
                   <pic:nvPicPr>
-                    <pic:cNvPr descr="class05w_files/figure-docx/unnamed-chunk-33-1.png" id="91" name="Picture"/>
+                    <pic:cNvPr descr="class05w_files/figure-docx/unnamed-chunk-34-1.png" id="91" name="Picture"/>
                     <pic:cNvPicPr>
                       <a:picLocks noChangeArrowheads="1" noChangeAspect="1"/>
                     </pic:cNvPicPr>
@@ -12620,7 +13300,7 @@
               <a:graphicData uri="http://schemas.openxmlformats.org/drawingml/2006/picture">
                 <pic:pic>
                   <pic:nvPicPr>
-                    <pic:cNvPr descr="class05w_files/figure-docx/unnamed-chunk-34-1.png" id="95" name="Picture"/>
+                    <pic:cNvPr descr="class05w_files/figure-docx/unnamed-chunk-35-1.png" id="95" name="Picture"/>
                     <pic:cNvPicPr>
                       <a:picLocks noChangeArrowheads="1" noChangeAspect="1"/>
                     </pic:cNvPicPr>
@@ -12775,54 +13455,483 @@
         </w:rPr>
         <w:t xml:space="preserve">(ldl)) </w:t>
       </w:r>
-    </w:p>
-    <w:p>
-      <w:pPr>
-        <w:pStyle w:val="SourceCode"/>
-      </w:pPr>
-      <w:r>
-        <w:rPr>
-          <w:rStyle w:val="VerbatimChar"/>
-        </w:rPr>
-        <w:t xml:space="preserve"># A tibble: 2 × 11</w:t>
-      </w:r>
-      <w:r>
-        <w:br/>
-      </w:r>
-      <w:r>
-        <w:rPr>
-          <w:rStyle w:val="VerbatimChar"/>
-        </w:rPr>
-        <w:t xml:space="preserve">  stat_f     n  miss  mean    sd   med   mad   min   q25   q75   max</w:t>
-      </w:r>
-      <w:r>
-        <w:br/>
-      </w:r>
-      <w:r>
-        <w:rPr>
-          <w:rStyle w:val="VerbatimChar"/>
-        </w:rPr>
-        <w:t xml:space="preserve">  &lt;fct&gt;  &lt;int&gt; &lt;int&gt; &lt;dbl&gt; &lt;dbl&gt; &lt;dbl&gt; &lt;dbl&gt; &lt;dbl&gt; &lt;dbl&gt; &lt;dbl&gt; &lt;dbl&gt;</w:t>
-      </w:r>
-      <w:r>
-        <w:br/>
-      </w:r>
-      <w:r>
-        <w:rPr>
-          <w:rStyle w:val="VerbatimChar"/>
-        </w:rPr>
-        <w:t xml:space="preserve">1 no        97     0  96.3  31.6    91  28.2    40    75   112   225</w:t>
-      </w:r>
-      <w:r>
-        <w:br/>
-      </w:r>
-      <w:r>
-        <w:rPr>
-          <w:rStyle w:val="VerbatimChar"/>
-        </w:rPr>
-        <w:t xml:space="preserve">2 statin   367     0 103.   39.5    93  34.1    40    77   126   231</w:t>
-      </w:r>
-    </w:p>
+      <w:r>
+        <w:rPr>
+          <w:rStyle w:val="SpecialCharTok"/>
+        </w:rPr>
+        <w:t xml:space="preserve">|&gt;</w:t>
+      </w:r>
+      <w:r>
+        <w:br/>
+      </w:r>
+      <w:r>
+        <w:rPr>
+          <w:rStyle w:val="NormalTok"/>
+        </w:rPr>
+        <w:t xml:space="preserve">  </w:t>
+      </w:r>
+      <w:r>
+        <w:rPr>
+          <w:rStyle w:val="FunctionTok"/>
+        </w:rPr>
+        <w:t xml:space="preserve">kable</w:t>
+      </w:r>
+      <w:r>
+        <w:rPr>
+          <w:rStyle w:val="NormalTok"/>
+        </w:rPr>
+        <w:t xml:space="preserve">(</w:t>
+      </w:r>
+      <w:r>
+        <w:rPr>
+          <w:rStyle w:val="AttributeTok"/>
+        </w:rPr>
+        <w:t xml:space="preserve">digits =</w:t>
+      </w:r>
+      <w:r>
+        <w:rPr>
+          <w:rStyle w:val="NormalTok"/>
+        </w:rPr>
+        <w:t xml:space="preserve"> </w:t>
+      </w:r>
+      <w:r>
+        <w:rPr>
+          <w:rStyle w:val="DecValTok"/>
+        </w:rPr>
+        <w:t xml:space="preserve">1</w:t>
+      </w:r>
+      <w:r>
+        <w:rPr>
+          <w:rStyle w:val="NormalTok"/>
+        </w:rPr>
+        <w:t xml:space="preserve">) </w:t>
+      </w:r>
+    </w:p>
+    <w:tbl>
+      <w:tblPr>
+        <w:tblStyle w:val="Table"/>
+        <w:tblW w:type="auto" w:w="0"/>
+        <w:tblLook w:firstRow="1" w:lastRow="0" w:firstColumn="0" w:lastColumn="0" w:noHBand="0" w:noVBand="0" w:val="0020"/>
+      </w:tblPr>
+      <w:tblGrid>
+        <w:gridCol w:w="720"/>
+        <w:gridCol w:w="720"/>
+        <w:gridCol w:w="720"/>
+        <w:gridCol w:w="720"/>
+        <w:gridCol w:w="720"/>
+        <w:gridCol w:w="720"/>
+        <w:gridCol w:w="720"/>
+        <w:gridCol w:w="720"/>
+        <w:gridCol w:w="720"/>
+        <w:gridCol w:w="720"/>
+        <w:gridCol w:w="720"/>
+      </w:tblGrid>
+      <w:tr>
+        <w:trPr>
+          <w:tblHeader w:val="on"/>
+        </w:trPr>
+        <w:tc>
+          <w:tcPr/>
+          <w:p>
+            <w:pPr>
+              <w:pStyle w:val="Compact"/>
+              <w:jc w:val="left"/>
+            </w:pPr>
+            <w:r>
+              <w:t xml:space="preserve">stat_f</w:t>
+            </w:r>
+          </w:p>
+        </w:tc>
+        <w:tc>
+          <w:tcPr/>
+          <w:p>
+            <w:pPr>
+              <w:pStyle w:val="Compact"/>
+              <w:jc w:val="right"/>
+            </w:pPr>
+            <w:r>
+              <w:t xml:space="preserve">n</w:t>
+            </w:r>
+          </w:p>
+        </w:tc>
+        <w:tc>
+          <w:tcPr/>
+          <w:p>
+            <w:pPr>
+              <w:pStyle w:val="Compact"/>
+              <w:jc w:val="right"/>
+            </w:pPr>
+            <w:r>
+              <w:t xml:space="preserve">miss</w:t>
+            </w:r>
+          </w:p>
+        </w:tc>
+        <w:tc>
+          <w:tcPr/>
+          <w:p>
+            <w:pPr>
+              <w:pStyle w:val="Compact"/>
+              <w:jc w:val="right"/>
+            </w:pPr>
+            <w:r>
+              <w:t xml:space="preserve">mean</w:t>
+            </w:r>
+          </w:p>
+        </w:tc>
+        <w:tc>
+          <w:tcPr/>
+          <w:p>
+            <w:pPr>
+              <w:pStyle w:val="Compact"/>
+              <w:jc w:val="right"/>
+            </w:pPr>
+            <w:r>
+              <w:t xml:space="preserve">sd</w:t>
+            </w:r>
+          </w:p>
+        </w:tc>
+        <w:tc>
+          <w:tcPr/>
+          <w:p>
+            <w:pPr>
+              <w:pStyle w:val="Compact"/>
+              <w:jc w:val="right"/>
+            </w:pPr>
+            <w:r>
+              <w:t xml:space="preserve">med</w:t>
+            </w:r>
+          </w:p>
+        </w:tc>
+        <w:tc>
+          <w:tcPr/>
+          <w:p>
+            <w:pPr>
+              <w:pStyle w:val="Compact"/>
+              <w:jc w:val="right"/>
+            </w:pPr>
+            <w:r>
+              <w:t xml:space="preserve">mad</w:t>
+            </w:r>
+          </w:p>
+        </w:tc>
+        <w:tc>
+          <w:tcPr/>
+          <w:p>
+            <w:pPr>
+              <w:pStyle w:val="Compact"/>
+              <w:jc w:val="right"/>
+            </w:pPr>
+            <w:r>
+              <w:t xml:space="preserve">min</w:t>
+            </w:r>
+          </w:p>
+        </w:tc>
+        <w:tc>
+          <w:tcPr/>
+          <w:p>
+            <w:pPr>
+              <w:pStyle w:val="Compact"/>
+              <w:jc w:val="right"/>
+            </w:pPr>
+            <w:r>
+              <w:t xml:space="preserve">q25</w:t>
+            </w:r>
+          </w:p>
+        </w:tc>
+        <w:tc>
+          <w:tcPr/>
+          <w:p>
+            <w:pPr>
+              <w:pStyle w:val="Compact"/>
+              <w:jc w:val="right"/>
+            </w:pPr>
+            <w:r>
+              <w:t xml:space="preserve">q75</w:t>
+            </w:r>
+          </w:p>
+        </w:tc>
+        <w:tc>
+          <w:tcPr/>
+          <w:p>
+            <w:pPr>
+              <w:pStyle w:val="Compact"/>
+              <w:jc w:val="right"/>
+            </w:pPr>
+            <w:r>
+              <w:t xml:space="preserve">max</w:t>
+            </w:r>
+          </w:p>
+        </w:tc>
+      </w:tr>
+      <w:tr>
+        <w:tc>
+          <w:tcPr/>
+          <w:p>
+            <w:pPr>
+              <w:pStyle w:val="Compact"/>
+              <w:jc w:val="left"/>
+            </w:pPr>
+            <w:r>
+              <w:t xml:space="preserve">no</w:t>
+            </w:r>
+          </w:p>
+        </w:tc>
+        <w:tc>
+          <w:tcPr/>
+          <w:p>
+            <w:pPr>
+              <w:pStyle w:val="Compact"/>
+              <w:jc w:val="right"/>
+            </w:pPr>
+            <w:r>
+              <w:t xml:space="preserve">97</w:t>
+            </w:r>
+          </w:p>
+        </w:tc>
+        <w:tc>
+          <w:tcPr/>
+          <w:p>
+            <w:pPr>
+              <w:pStyle w:val="Compact"/>
+              <w:jc w:val="right"/>
+            </w:pPr>
+            <w:r>
+              <w:t xml:space="preserve">0</w:t>
+            </w:r>
+          </w:p>
+        </w:tc>
+        <w:tc>
+          <w:tcPr/>
+          <w:p>
+            <w:pPr>
+              <w:pStyle w:val="Compact"/>
+              <w:jc w:val="right"/>
+            </w:pPr>
+            <w:r>
+              <w:t xml:space="preserve">96.3</w:t>
+            </w:r>
+          </w:p>
+        </w:tc>
+        <w:tc>
+          <w:tcPr/>
+          <w:p>
+            <w:pPr>
+              <w:pStyle w:val="Compact"/>
+              <w:jc w:val="right"/>
+            </w:pPr>
+            <w:r>
+              <w:t xml:space="preserve">31.6</w:t>
+            </w:r>
+          </w:p>
+        </w:tc>
+        <w:tc>
+          <w:tcPr/>
+          <w:p>
+            <w:pPr>
+              <w:pStyle w:val="Compact"/>
+              <w:jc w:val="right"/>
+            </w:pPr>
+            <w:r>
+              <w:t xml:space="preserve">91</w:t>
+            </w:r>
+          </w:p>
+        </w:tc>
+        <w:tc>
+          <w:tcPr/>
+          <w:p>
+            <w:pPr>
+              <w:pStyle w:val="Compact"/>
+              <w:jc w:val="right"/>
+            </w:pPr>
+            <w:r>
+              <w:t xml:space="preserve">28.2</w:t>
+            </w:r>
+          </w:p>
+        </w:tc>
+        <w:tc>
+          <w:tcPr/>
+          <w:p>
+            <w:pPr>
+              <w:pStyle w:val="Compact"/>
+              <w:jc w:val="right"/>
+            </w:pPr>
+            <w:r>
+              <w:t xml:space="preserve">40</w:t>
+            </w:r>
+          </w:p>
+        </w:tc>
+        <w:tc>
+          <w:tcPr/>
+          <w:p>
+            <w:pPr>
+              <w:pStyle w:val="Compact"/>
+              <w:jc w:val="right"/>
+            </w:pPr>
+            <w:r>
+              <w:t xml:space="preserve">75</w:t>
+            </w:r>
+          </w:p>
+        </w:tc>
+        <w:tc>
+          <w:tcPr/>
+          <w:p>
+            <w:pPr>
+              <w:pStyle w:val="Compact"/>
+              <w:jc w:val="right"/>
+            </w:pPr>
+            <w:r>
+              <w:t xml:space="preserve">112</w:t>
+            </w:r>
+          </w:p>
+        </w:tc>
+        <w:tc>
+          <w:tcPr/>
+          <w:p>
+            <w:pPr>
+              <w:pStyle w:val="Compact"/>
+              <w:jc w:val="right"/>
+            </w:pPr>
+            <w:r>
+              <w:t xml:space="preserve">225</w:t>
+            </w:r>
+          </w:p>
+        </w:tc>
+      </w:tr>
+      <w:tr>
+        <w:tc>
+          <w:tcPr/>
+          <w:p>
+            <w:pPr>
+              <w:pStyle w:val="Compact"/>
+              <w:jc w:val="left"/>
+            </w:pPr>
+            <w:r>
+              <w:t xml:space="preserve">statin</w:t>
+            </w:r>
+          </w:p>
+        </w:tc>
+        <w:tc>
+          <w:tcPr/>
+          <w:p>
+            <w:pPr>
+              <w:pStyle w:val="Compact"/>
+              <w:jc w:val="right"/>
+            </w:pPr>
+            <w:r>
+              <w:t xml:space="preserve">367</w:t>
+            </w:r>
+          </w:p>
+        </w:tc>
+        <w:tc>
+          <w:tcPr/>
+          <w:p>
+            <w:pPr>
+              <w:pStyle w:val="Compact"/>
+              <w:jc w:val="right"/>
+            </w:pPr>
+            <w:r>
+              <w:t xml:space="preserve">0</w:t>
+            </w:r>
+          </w:p>
+        </w:tc>
+        <w:tc>
+          <w:tcPr/>
+          <w:p>
+            <w:pPr>
+              <w:pStyle w:val="Compact"/>
+              <w:jc w:val="right"/>
+            </w:pPr>
+            <w:r>
+              <w:t xml:space="preserve">103.4</w:t>
+            </w:r>
+          </w:p>
+        </w:tc>
+        <w:tc>
+          <w:tcPr/>
+          <w:p>
+            <w:pPr>
+              <w:pStyle w:val="Compact"/>
+              <w:jc w:val="right"/>
+            </w:pPr>
+            <w:r>
+              <w:t xml:space="preserve">39.5</w:t>
+            </w:r>
+          </w:p>
+        </w:tc>
+        <w:tc>
+          <w:tcPr/>
+          <w:p>
+            <w:pPr>
+              <w:pStyle w:val="Compact"/>
+              <w:jc w:val="right"/>
+            </w:pPr>
+            <w:r>
+              <w:t xml:space="preserve">93</w:t>
+            </w:r>
+          </w:p>
+        </w:tc>
+        <w:tc>
+          <w:tcPr/>
+          <w:p>
+            <w:pPr>
+              <w:pStyle w:val="Compact"/>
+              <w:jc w:val="right"/>
+            </w:pPr>
+            <w:r>
+              <w:t xml:space="preserve">34.1</w:t>
+            </w:r>
+          </w:p>
+        </w:tc>
+        <w:tc>
+          <w:tcPr/>
+          <w:p>
+            <w:pPr>
+              <w:pStyle w:val="Compact"/>
+              <w:jc w:val="right"/>
+            </w:pPr>
+            <w:r>
+              <w:t xml:space="preserve">40</w:t>
+            </w:r>
+          </w:p>
+        </w:tc>
+        <w:tc>
+          <w:tcPr/>
+          <w:p>
+            <w:pPr>
+              <w:pStyle w:val="Compact"/>
+              <w:jc w:val="right"/>
+            </w:pPr>
+            <w:r>
+              <w:t xml:space="preserve">77</w:t>
+            </w:r>
+          </w:p>
+        </w:tc>
+        <w:tc>
+          <w:tcPr/>
+          <w:p>
+            <w:pPr>
+              <w:pStyle w:val="Compact"/>
+              <w:jc w:val="right"/>
+            </w:pPr>
+            <w:r>
+              <w:t xml:space="preserve">126</w:t>
+            </w:r>
+          </w:p>
+        </w:tc>
+        <w:tc>
+          <w:tcPr/>
+          <w:p>
+            <w:pPr>
+              <w:pStyle w:val="Compact"/>
+              <w:jc w:val="right"/>
+            </w:pPr>
+            <w:r>
+              <w:t xml:space="preserve">231</w:t>
+            </w:r>
+          </w:p>
+        </w:tc>
+      </w:tr>
+    </w:tbl>
     <w:p>
       <w:pPr>
         <w:pStyle w:val="Compact"/>

</xml_diff>